<commit_message>
Add a second paper paragraph to default template
</commit_message>
<xml_diff>
--- a/postgrad-recommendation-letter-init/assets/default-letter-template.docx
+++ b/postgrad-recommendation-letter-init/assets/default-letter-template.docx
@@ -257,7 +257,22 @@
         <w:rPr>
           <w:b w:val="0"/>
         </w:rPr>
-        <w:t>我重点阅读了您作为{{AUTHOR_ROLE}}发表的《{{PAPER_TITLE}}》（{{VENUE}}，{{YEAR}}）。论文围绕{{PAPER_PROBLEM}}展开，通过{{PAPER_MECHANISM}}进行研究；从{{PAPER_EVIDENCE}}可以看出{{PAPER_SUPPORTED_CLAIM}}，同时其{{PAPER_LIMITATION}}也提醒我在理解研究结论时需要关注证据边界。</w:t>
+        <w:t>我重点阅读了您作为{{PAPER1_AUTHOR_ROLE}}发表的《{{PAPER1_TITLE}}》（{{PAPER1_VENUE}}，{{PAPER1_YEAR}}）。论文围绕{{PAPER1_PROBLEM}}展开，通过{{PAPER1_MECHANISM}}进行研究；从{{PAPER1_EVIDENCE}}可以看出{{PAPER1_SUPPORTED_CLAIM}}，同时其{{PAPER1_LIMITATION}}也提醒我在理解研究结论时需要关注证据边界。</w:t>
+      </w:r>
+    </w:p>
+    <w:p>
+      <w:pPr>
+        <w:ind w:firstLine="420" w:firstLineChars="0"/>
+        <w:rPr>
+          <w:rFonts w:hint="eastAsia"/>
+          <w:lang w:val="en-US" w:eastAsia="zh-CN"/>
+        </w:rPr>
+      </w:pPr>
+      <w:r>
+        <w:rPr>
+          <w:b w:val="0"/>
+        </w:rPr>
+        <w:t>我重点阅读了您作为{{PAPER2_AUTHOR_ROLE}}发表的《{{PAPER2_TITLE}}》（{{PAPER2_VENUE}}，{{PAPER2_YEAR}}）。论文围绕{{PAPER2_PROBLEM}}展开，通过{{PAPER2_MECHANISM}}进行研究；从{{PAPER2_EVIDENCE}}可以看出{{PAPER2_SUPPORTED_CLAIM}}，同时其{{PAPER2_LIMITATION}}也提醒我在理解研究结论时需要关注证据边界。</w:t>
       </w:r>
     </w:p>
     <w:p>

</xml_diff>